<commit_message>
Added Gantt Chart into Project Plan.
</commit_message>
<xml_diff>
--- a/project_plan/unsw-ZZSC9020-Project-Plan-2026 H2 Group A.docx
+++ b/project_plan/unsw-ZZSC9020-Project-Plan-2026 H2 Group A.docx
@@ -1782,8 +1782,85 @@
         <w:pStyle w:val="FirstParagraph"/>
       </w:pPr>
       <w:r>
+        <w:rPr>
+          <w:noProof/>
+        </w:rPr>
+        <w:drawing>
+          <wp:anchor distT="0" distB="0" distL="114300" distR="114300" simplePos="0" relativeHeight="251658240" behindDoc="0" locked="0" layoutInCell="1" allowOverlap="1" wp14:anchorId="29B11DCC" wp14:editId="6B97518E">
+            <wp:simplePos x="0" y="0"/>
+            <wp:positionH relativeFrom="column">
+              <wp:posOffset>-660400</wp:posOffset>
+            </wp:positionH>
+            <wp:positionV relativeFrom="paragraph">
+              <wp:posOffset>603250</wp:posOffset>
+            </wp:positionV>
+            <wp:extent cx="7295515" cy="3499485"/>
+            <wp:effectExtent l="19050" t="19050" r="19685" b="24765"/>
+            <wp:wrapTopAndBottom/>
+            <wp:docPr id="78567042" name="Picture 1"/>
+            <wp:cNvGraphicFramePr>
+              <a:graphicFrameLocks xmlns:a="http://schemas.openxmlformats.org/drawingml/2006/main" noChangeAspect="1"/>
+            </wp:cNvGraphicFramePr>
+            <a:graphic xmlns:a="http://schemas.openxmlformats.org/drawingml/2006/main">
+              <a:graphicData uri="http://schemas.openxmlformats.org/drawingml/2006/picture">
+                <pic:pic xmlns:pic="http://schemas.openxmlformats.org/drawingml/2006/picture">
+                  <pic:nvPicPr>
+                    <pic:cNvPr id="0" name="Picture 1"/>
+                    <pic:cNvPicPr>
+                      <a:picLocks noChangeAspect="1" noChangeArrowheads="1"/>
+                    </pic:cNvPicPr>
+                  </pic:nvPicPr>
+                  <pic:blipFill>
+                    <a:blip r:embed="rId7">
+                      <a:extLst>
+                        <a:ext uri="{28A0092B-C50C-407E-A947-70E740481C1C}">
+                          <a14:useLocalDpi xmlns:a14="http://schemas.microsoft.com/office/drawing/2010/main" val="0"/>
+                        </a:ext>
+                      </a:extLst>
+                    </a:blip>
+                    <a:srcRect/>
+                    <a:stretch>
+                      <a:fillRect/>
+                    </a:stretch>
+                  </pic:blipFill>
+                  <pic:spPr bwMode="auto">
+                    <a:xfrm>
+                      <a:off x="0" y="0"/>
+                      <a:ext cx="7295515" cy="3499485"/>
+                    </a:xfrm>
+                    <a:prstGeom prst="rect">
+                      <a:avLst/>
+                    </a:prstGeom>
+                    <a:noFill/>
+                    <a:ln>
+                      <a:solidFill>
+                        <a:schemeClr val="accent1">
+                          <a:lumMod val="20000"/>
+                          <a:lumOff val="80000"/>
+                        </a:schemeClr>
+                      </a:solidFill>
+                    </a:ln>
+                  </pic:spPr>
+                </pic:pic>
+              </a:graphicData>
+            </a:graphic>
+            <wp14:sizeRelH relativeFrom="margin">
+              <wp14:pctWidth>0</wp14:pctWidth>
+            </wp14:sizeRelH>
+            <wp14:sizeRelV relativeFrom="margin">
+              <wp14:pctHeight>0</wp14:pctHeight>
+            </wp14:sizeRelV>
+          </wp:anchor>
+        </w:drawing>
+      </w:r>
+      <w:r>
         <w:t>The team will collaborate through online meetings and shared working environments. Microsoft Teams will be used for group meetings and communication.</w:t>
       </w:r>
+    </w:p>
+    <w:p>
+      <w:pPr>
+        <w:pStyle w:val="BodyText"/>
+      </w:pPr>
     </w:p>
     <w:tbl>
       <w:tblPr>
@@ -1803,6 +1880,7 @@
           </w:tcPr>
           <w:p>
             <w:r>
+              <w:lastRenderedPageBreak/>
               <w:t>Week 1</w:t>
             </w:r>
           </w:p>
@@ -2084,7 +2162,7 @@
                     </pic:cNvPicPr>
                   </pic:nvPicPr>
                   <pic:blipFill>
-                    <a:blip r:embed="rId7" cstate="print">
+                    <a:blip r:embed="rId8" cstate="print">
                       <a:extLst>
                         <a:ext uri="{28A0092B-C50C-407E-A947-70E740481C1C}">
                           <a14:useLocalDpi xmlns:a14="http://schemas.microsoft.com/office/drawing/2010/main" val="0"/>
@@ -2286,6 +2364,7 @@
         <w:pStyle w:val="BodyText"/>
       </w:pPr>
       <w:r>
+        <w:lastRenderedPageBreak/>
         <w:t xml:space="preserve">The main contribution of the project is to evaluate whether modern transformer-based models such as </w:t>
       </w:r>
       <w:proofErr w:type="spellStart"/>
@@ -2323,7 +2402,6 @@
       </w:pPr>
       <w:bookmarkStart w:id="11" w:name="_Toc224148705"/>
       <w:r>
-        <w:lastRenderedPageBreak/>
         <w:t>References</w:t>
       </w:r>
       <w:bookmarkEnd w:id="11"/>

</xml_diff>

<commit_message>
Updated Gantt chart on project plan.
</commit_message>
<xml_diff>
--- a/project_plan/unsw-ZZSC9020-Project-Plan-2026 H2 Group A.docx
+++ b/project_plan/unsw-ZZSC9020-Project-Plan-2026 H2 Group A.docx
@@ -1786,18 +1786,18 @@
           <w:noProof/>
         </w:rPr>
         <w:drawing>
-          <wp:anchor distT="0" distB="0" distL="114300" distR="114300" simplePos="0" relativeHeight="251658240" behindDoc="0" locked="0" layoutInCell="1" allowOverlap="1" wp14:anchorId="29B11DCC" wp14:editId="6B97518E">
+          <wp:anchor distT="0" distB="0" distL="114300" distR="114300" simplePos="0" relativeHeight="251658240" behindDoc="0" locked="0" layoutInCell="1" allowOverlap="1" wp14:anchorId="411BFF7B" wp14:editId="421CB7E9">
             <wp:simplePos x="0" y="0"/>
             <wp:positionH relativeFrom="column">
-              <wp:posOffset>-660400</wp:posOffset>
+              <wp:posOffset>-698500</wp:posOffset>
             </wp:positionH>
             <wp:positionV relativeFrom="paragraph">
               <wp:posOffset>603250</wp:posOffset>
             </wp:positionV>
-            <wp:extent cx="7295515" cy="3499485"/>
-            <wp:effectExtent l="19050" t="19050" r="19685" b="24765"/>
+            <wp:extent cx="7340600" cy="3521075"/>
+            <wp:effectExtent l="19050" t="19050" r="12700" b="22225"/>
             <wp:wrapTopAndBottom/>
-            <wp:docPr id="78567042" name="Picture 1"/>
+            <wp:docPr id="207323580" name="Picture 2"/>
             <wp:cNvGraphicFramePr>
               <a:graphicFrameLocks xmlns:a="http://schemas.openxmlformats.org/drawingml/2006/main" noChangeAspect="1"/>
             </wp:cNvGraphicFramePr>
@@ -1805,7 +1805,7 @@
               <a:graphicData uri="http://schemas.openxmlformats.org/drawingml/2006/picture">
                 <pic:pic xmlns:pic="http://schemas.openxmlformats.org/drawingml/2006/picture">
                   <pic:nvPicPr>
-                    <pic:cNvPr id="0" name="Picture 1"/>
+                    <pic:cNvPr id="0" name="Picture 2"/>
                     <pic:cNvPicPr>
                       <a:picLocks noChangeAspect="1" noChangeArrowheads="1"/>
                     </pic:cNvPicPr>
@@ -1826,7 +1826,7 @@
                   <pic:spPr bwMode="auto">
                     <a:xfrm>
                       <a:off x="0" y="0"/>
-                      <a:ext cx="7295515" cy="3499485"/>
+                      <a:ext cx="7340600" cy="3521075"/>
                     </a:xfrm>
                     <a:prstGeom prst="rect">
                       <a:avLst/>

</xml_diff>